<commit_message>
feat : remplisage du rapport et planif
</commit_message>
<xml_diff>
--- a/T-P_OO-Rapport de projet.docx
+++ b/T-P_OO-Rapport de projet.docx
@@ -4078,48 +4078,19 @@
     </w:p>
     <w:p>
       <w:pPr>
+        <w:pStyle w:val="Retraitcorpsdetexte3"/>
+      </w:pPr>
+    </w:p>
+    <w:p>
+      <w:pPr>
         <w:pStyle w:val="Titre3"/>
       </w:pPr>
-      <w:bookmarkStart w:id="10" w:name="_Toc308526324"/>
+      <w:bookmarkStart w:id="10" w:name="_Toc308526325"/>
       <w:r>
         <w:lastRenderedPageBreak/>
-        <w:t>Fonctionnalités requises (du point de vue de l’utilisateur)</w:t>
+        <w:t>Contraintes</w:t>
       </w:r>
       <w:bookmarkEnd w:id="10"/>
-    </w:p>
-    <w:p>
-      <w:pPr>
-        <w:pStyle w:val="Retraitcorpsdetexte3"/>
-      </w:pPr>
-    </w:p>
-    <w:p>
-      <w:pPr>
-        <w:pStyle w:val="Informations"/>
-      </w:pPr>
-      <w:r>
-        <w:t xml:space="preserve">A compléter </w:t>
-      </w:r>
-      <w:r>
-        <w:t xml:space="preserve">par une espèce de mode d’emploi du produit. S’il s’agissait d’une montre, décrire qu’à part l’heure, il y aura la possibilité d’utiliser un chronomètre, un réveil, </w:t>
-      </w:r>
-      <w:r>
-        <w:t xml:space="preserve">… </w:t>
-      </w:r>
-    </w:p>
-    <w:p>
-      <w:pPr>
-        <w:pStyle w:val="Retraitcorpsdetexte3"/>
-      </w:pPr>
-    </w:p>
-    <w:p>
-      <w:pPr>
-        <w:pStyle w:val="Titre3"/>
-      </w:pPr>
-      <w:bookmarkStart w:id="11" w:name="_Toc308526325"/>
-      <w:r>
-        <w:t>Contraintes</w:t>
-      </w:r>
-      <w:bookmarkEnd w:id="11"/>
     </w:p>
     <w:p>
       <w:pPr>
@@ -4267,11 +4238,11 @@
       <w:pPr>
         <w:pStyle w:val="Titre3"/>
       </w:pPr>
-      <w:bookmarkStart w:id="12" w:name="_Toc308526326"/>
+      <w:bookmarkStart w:id="11" w:name="_Toc308526326"/>
       <w:r>
         <w:t>Travail à réaliser par l'apprenti</w:t>
       </w:r>
-      <w:bookmarkEnd w:id="12"/>
+      <w:bookmarkEnd w:id="11"/>
     </w:p>
     <w:p>
       <w:pPr>
@@ -4448,7 +4419,6 @@
         <w:pStyle w:val="Retraitcorpsdetexte3"/>
       </w:pPr>
       <w:r>
-        <w:lastRenderedPageBreak/>
         <w:t>Afficher un plan du parking avec un moyen d’indiquer quelles sont les places occupées et</w:t>
       </w:r>
     </w:p>
@@ -4508,6 +4478,7 @@
       </w:pPr>
       <w:proofErr w:type="gramStart"/>
       <w:r>
+        <w:lastRenderedPageBreak/>
         <w:t>rechercher</w:t>
       </w:r>
       <w:proofErr w:type="gramEnd"/>
@@ -4641,11 +4612,11 @@
       <w:pPr>
         <w:pStyle w:val="Titre3"/>
       </w:pPr>
-      <w:bookmarkStart w:id="13" w:name="_Toc308526327"/>
+      <w:bookmarkStart w:id="12" w:name="_Toc308526327"/>
       <w:r>
         <w:t>Si le temps le permet …</w:t>
       </w:r>
-      <w:bookmarkEnd w:id="13"/>
+      <w:bookmarkEnd w:id="12"/>
     </w:p>
     <w:p>
       <w:pPr>
@@ -4722,11 +4693,11 @@
       <w:pPr>
         <w:pStyle w:val="Titre2"/>
       </w:pPr>
-      <w:bookmarkStart w:id="14" w:name="_Toc308526329"/>
+      <w:bookmarkStart w:id="13" w:name="_Toc308526329"/>
       <w:r>
         <w:t>Les points suivants seront évalués</w:t>
       </w:r>
-      <w:bookmarkEnd w:id="14"/>
+      <w:bookmarkEnd w:id="13"/>
     </w:p>
     <w:p>
       <w:pPr>
@@ -4807,11 +4778,11 @@
       <w:pPr>
         <w:pStyle w:val="Titre2"/>
       </w:pPr>
-      <w:bookmarkStart w:id="15" w:name="_Toc308526330"/>
+      <w:bookmarkStart w:id="14" w:name="_Toc308526330"/>
       <w:r>
         <w:t>Validation et conditions de réussite</w:t>
       </w:r>
-      <w:bookmarkEnd w:id="15"/>
+      <w:bookmarkEnd w:id="14"/>
     </w:p>
     <w:p>
       <w:pPr>
@@ -4834,7 +4805,6 @@
         </w:numPr>
       </w:pPr>
       <w:r>
-        <w:lastRenderedPageBreak/>
         <w:t>Possibilité de transmettre le travail à une personne extérieure pour le terminer, le corriger ou le compléter</w:t>
       </w:r>
     </w:p>
@@ -4854,395 +4824,507 @@
       <w:pPr>
         <w:pStyle w:val="Titre1"/>
       </w:pPr>
-      <w:bookmarkStart w:id="16" w:name="_Toc532179957"/>
-      <w:bookmarkStart w:id="17" w:name="_Toc165969641"/>
-      <w:bookmarkStart w:id="18" w:name="_Toc308526332"/>
+      <w:r>
+        <w:lastRenderedPageBreak/>
+        <w:t>Planification</w:t>
+      </w:r>
+    </w:p>
+    <w:p>
+      <w:pPr>
+        <w:pStyle w:val="Retraitcorpsdetexte"/>
+        <w:ind w:left="567"/>
+      </w:pPr>
+      <w:r>
+        <w:drawing>
+          <wp:inline distT="0" distB="0" distL="0" distR="0" wp14:anchorId="1BD54B54" wp14:editId="22A179F3">
+            <wp:extent cx="5749925" cy="2874963"/>
+            <wp:effectExtent l="0" t="0" r="3175" b="1905"/>
+            <wp:docPr id="776281169" name="Image 1"/>
+            <wp:cNvGraphicFramePr>
+              <a:graphicFrameLocks xmlns:a="http://schemas.openxmlformats.org/drawingml/2006/main" noChangeAspect="1"/>
+            </wp:cNvGraphicFramePr>
+            <a:graphic xmlns:a="http://schemas.openxmlformats.org/drawingml/2006/main">
+              <a:graphicData uri="http://schemas.openxmlformats.org/drawingml/2006/picture">
+                <pic:pic xmlns:pic="http://schemas.openxmlformats.org/drawingml/2006/picture">
+                  <pic:nvPicPr>
+                    <pic:cNvPr id="776281169" name=""/>
+                    <pic:cNvPicPr/>
+                  </pic:nvPicPr>
+                  <pic:blipFill>
+                    <a:blip r:embed="rId12"/>
+                    <a:stretch>
+                      <a:fillRect/>
+                    </a:stretch>
+                  </pic:blipFill>
+                  <pic:spPr>
+                    <a:xfrm>
+                      <a:off x="0" y="0"/>
+                      <a:ext cx="5752455" cy="2876228"/>
+                    </a:xfrm>
+                    <a:prstGeom prst="rect">
+                      <a:avLst/>
+                    </a:prstGeom>
+                  </pic:spPr>
+                </pic:pic>
+              </a:graphicData>
+            </a:graphic>
+          </wp:inline>
+        </w:drawing>
+      </w:r>
+    </w:p>
+    <w:p>
+      <w:pPr>
+        <w:pStyle w:val="Retraitcorpsdetexte"/>
+        <w:ind w:left="567"/>
+      </w:pPr>
+      <w:r>
+        <w:drawing>
+          <wp:inline distT="0" distB="0" distL="0" distR="0" wp14:anchorId="04CA243C" wp14:editId="305FC36D">
+            <wp:extent cx="5759450" cy="2877185"/>
+            <wp:effectExtent l="0" t="0" r="0" b="0"/>
+            <wp:docPr id="462581419" name="Image 1"/>
+            <wp:cNvGraphicFramePr>
+              <a:graphicFrameLocks xmlns:a="http://schemas.openxmlformats.org/drawingml/2006/main" noChangeAspect="1"/>
+            </wp:cNvGraphicFramePr>
+            <a:graphic xmlns:a="http://schemas.openxmlformats.org/drawingml/2006/main">
+              <a:graphicData uri="http://schemas.openxmlformats.org/drawingml/2006/picture">
+                <pic:pic xmlns:pic="http://schemas.openxmlformats.org/drawingml/2006/picture">
+                  <pic:nvPicPr>
+                    <pic:cNvPr id="462581419" name=""/>
+                    <pic:cNvPicPr/>
+                  </pic:nvPicPr>
+                  <pic:blipFill>
+                    <a:blip r:embed="rId13"/>
+                    <a:stretch>
+                      <a:fillRect/>
+                    </a:stretch>
+                  </pic:blipFill>
+                  <pic:spPr>
+                    <a:xfrm>
+                      <a:off x="0" y="0"/>
+                      <a:ext cx="5759450" cy="2877185"/>
+                    </a:xfrm>
+                    <a:prstGeom prst="rect">
+                      <a:avLst/>
+                    </a:prstGeom>
+                  </pic:spPr>
+                </pic:pic>
+              </a:graphicData>
+            </a:graphic>
+          </wp:inline>
+        </w:drawing>
+      </w:r>
+    </w:p>
+    <w:p>
+      <w:pPr>
+        <w:pStyle w:val="Retraitcorpsdetexte"/>
+        <w:ind w:left="567"/>
+      </w:pPr>
+      <w:r>
+        <w:lastRenderedPageBreak/>
+        <w:drawing>
+          <wp:inline distT="0" distB="0" distL="0" distR="0" wp14:anchorId="59CEE6C6" wp14:editId="7E58453F">
+            <wp:extent cx="5759450" cy="2887345"/>
+            <wp:effectExtent l="0" t="0" r="0" b="8255"/>
+            <wp:docPr id="1735724347" name="Image 1"/>
+            <wp:cNvGraphicFramePr>
+              <a:graphicFrameLocks xmlns:a="http://schemas.openxmlformats.org/drawingml/2006/main" noChangeAspect="1"/>
+            </wp:cNvGraphicFramePr>
+            <a:graphic xmlns:a="http://schemas.openxmlformats.org/drawingml/2006/main">
+              <a:graphicData uri="http://schemas.openxmlformats.org/drawingml/2006/picture">
+                <pic:pic xmlns:pic="http://schemas.openxmlformats.org/drawingml/2006/picture">
+                  <pic:nvPicPr>
+                    <pic:cNvPr id="1735724347" name=""/>
+                    <pic:cNvPicPr/>
+                  </pic:nvPicPr>
+                  <pic:blipFill>
+                    <a:blip r:embed="rId14"/>
+                    <a:stretch>
+                      <a:fillRect/>
+                    </a:stretch>
+                  </pic:blipFill>
+                  <pic:spPr>
+                    <a:xfrm>
+                      <a:off x="0" y="0"/>
+                      <a:ext cx="5759450" cy="2887345"/>
+                    </a:xfrm>
+                    <a:prstGeom prst="rect">
+                      <a:avLst/>
+                    </a:prstGeom>
+                  </pic:spPr>
+                </pic:pic>
+              </a:graphicData>
+            </a:graphic>
+          </wp:inline>
+        </w:drawing>
+      </w:r>
+    </w:p>
+    <w:p>
+      <w:pPr>
+        <w:pStyle w:val="Retraitcorpsdetexte"/>
+        <w:ind w:left="567"/>
+      </w:pPr>
+      <w:r>
+        <w:drawing>
+          <wp:inline distT="0" distB="0" distL="0" distR="0" wp14:anchorId="65AF408D" wp14:editId="276C29B5">
+            <wp:extent cx="5759450" cy="2869565"/>
+            <wp:effectExtent l="0" t="0" r="0" b="6985"/>
+            <wp:docPr id="910455874" name="Image 1"/>
+            <wp:cNvGraphicFramePr>
+              <a:graphicFrameLocks xmlns:a="http://schemas.openxmlformats.org/drawingml/2006/main" noChangeAspect="1"/>
+            </wp:cNvGraphicFramePr>
+            <a:graphic xmlns:a="http://schemas.openxmlformats.org/drawingml/2006/main">
+              <a:graphicData uri="http://schemas.openxmlformats.org/drawingml/2006/picture">
+                <pic:pic xmlns:pic="http://schemas.openxmlformats.org/drawingml/2006/picture">
+                  <pic:nvPicPr>
+                    <pic:cNvPr id="910455874" name=""/>
+                    <pic:cNvPicPr/>
+                  </pic:nvPicPr>
+                  <pic:blipFill>
+                    <a:blip r:embed="rId15"/>
+                    <a:stretch>
+                      <a:fillRect/>
+                    </a:stretch>
+                  </pic:blipFill>
+                  <pic:spPr>
+                    <a:xfrm>
+                      <a:off x="0" y="0"/>
+                      <a:ext cx="5759450" cy="2869565"/>
+                    </a:xfrm>
+                    <a:prstGeom prst="rect">
+                      <a:avLst/>
+                    </a:prstGeom>
+                  </pic:spPr>
+                </pic:pic>
+              </a:graphicData>
+            </a:graphic>
+          </wp:inline>
+        </w:drawing>
+      </w:r>
+    </w:p>
+    <w:p>
+      <w:pPr>
+        <w:pStyle w:val="Retraitcorpsdetexte"/>
+      </w:pPr>
+    </w:p>
+    <w:p>
+      <w:pPr>
+        <w:pStyle w:val="Titre1"/>
+      </w:pPr>
+      <w:bookmarkStart w:id="15" w:name="_Toc532179957"/>
+      <w:bookmarkStart w:id="16" w:name="_Toc165969641"/>
+      <w:bookmarkStart w:id="17" w:name="_Toc308526332"/>
       <w:bookmarkEnd w:id="4"/>
       <w:bookmarkEnd w:id="5"/>
       <w:r>
         <w:t>Analyse</w:t>
       </w:r>
+      <w:bookmarkEnd w:id="15"/>
       <w:bookmarkEnd w:id="16"/>
       <w:bookmarkEnd w:id="17"/>
+    </w:p>
+    <w:p>
+      <w:pPr>
+        <w:pStyle w:val="Titre2"/>
+      </w:pPr>
+      <w:bookmarkStart w:id="18" w:name="_Toc308526333"/>
+      <w:r>
+        <w:t>Opportunités</w:t>
+      </w:r>
       <w:bookmarkEnd w:id="18"/>
     </w:p>
     <w:p>
       <w:pPr>
+        <w:pStyle w:val="Retraitcorpsdetexte"/>
+      </w:pPr>
+      <w:r>
+        <w:t>S</w:t>
+      </w:r>
+      <w:r>
+        <w:t xml:space="preserve">tructurer un programme </w:t>
+      </w:r>
+      <w:r>
+        <w:t>avec des</w:t>
+      </w:r>
+      <w:r>
+        <w:t xml:space="preserve"> classes cohérentes (Parking, </w:t>
+      </w:r>
+      <w:proofErr w:type="spellStart"/>
+      <w:r>
+        <w:t>PlaceParking</w:t>
+      </w:r>
+      <w:proofErr w:type="spellEnd"/>
+      <w:r>
+        <w:t xml:space="preserve">, </w:t>
+      </w:r>
+      <w:proofErr w:type="spellStart"/>
+      <w:r>
+        <w:t>Vehicule</w:t>
+      </w:r>
+      <w:proofErr w:type="spellEnd"/>
+      <w:r>
+        <w:t xml:space="preserve">, Ticket), simuler </w:t>
+      </w:r>
+      <w:r>
+        <w:t>le</w:t>
+      </w:r>
+      <w:r>
+        <w:t xml:space="preserve"> temps,</w:t>
+      </w:r>
+      <w:r>
+        <w:t xml:space="preserve"> faire des tests</w:t>
+      </w:r>
+      <w:r>
+        <w:t>.</w:t>
+      </w:r>
+      <w:r>
+        <w:t xml:space="preserve"> </w:t>
+      </w:r>
+    </w:p>
+    <w:p>
+      <w:pPr>
         <w:pStyle w:val="Titre2"/>
       </w:pPr>
-      <w:bookmarkStart w:id="19" w:name="_Toc308526333"/>
-      <w:r>
-        <w:t>Opportunités</w:t>
+      <w:bookmarkStart w:id="19" w:name="_Toc532179959"/>
+      <w:bookmarkStart w:id="20" w:name="_Toc165969643"/>
+      <w:bookmarkStart w:id="21" w:name="_Toc308526334"/>
+      <w:r>
+        <w:t>Document d’analyse</w:t>
       </w:r>
       <w:bookmarkEnd w:id="19"/>
-    </w:p>
-    <w:p>
-      <w:pPr>
-        <w:pStyle w:val="Informations"/>
+      <w:bookmarkEnd w:id="20"/>
+      <w:r>
+        <w:t xml:space="preserve"> et conception</w:t>
+      </w:r>
+      <w:bookmarkEnd w:id="21"/>
+    </w:p>
+    <w:p>
+      <w:pPr>
+        <w:pStyle w:val="Retraitcorpsdetexte"/>
+      </w:pPr>
+      <w:r>
+        <w:t xml:space="preserve">Le programme propose </w:t>
+      </w:r>
+      <w:r>
+        <w:t>6</w:t>
+      </w:r>
+      <w:r>
+        <w:t xml:space="preserve"> fonctionnalités </w:t>
+      </w:r>
+      <w:r>
+        <w:t xml:space="preserve">grâce </w:t>
+      </w:r>
+      <w:proofErr w:type="spellStart"/>
+      <w:r>
+        <w:t>a</w:t>
+      </w:r>
+      <w:proofErr w:type="spellEnd"/>
+      <w:r>
+        <w:t xml:space="preserve"> un menu console : </w:t>
+      </w:r>
+    </w:p>
+    <w:p>
+      <w:pPr>
+        <w:pStyle w:val="Retraitcorpsdetexte"/>
+      </w:pPr>
+      <w:r>
+        <w:t>Entrée</w:t>
+      </w:r>
+      <w:r>
+        <w:t>/</w:t>
+      </w:r>
+      <w:r>
+        <w:t xml:space="preserve"> sortie</w:t>
+      </w:r>
+      <w:r>
+        <w:t>/</w:t>
+      </w:r>
+      <w:r>
+        <w:t xml:space="preserve"> affichage de l'état du parking</w:t>
+      </w:r>
+      <w:r>
+        <w:t>/</w:t>
+      </w:r>
+      <w:r>
+        <w:t xml:space="preserve"> recherche d'un véhicule</w:t>
+      </w:r>
+      <w:r>
+        <w:t>/</w:t>
+      </w:r>
+      <w:r>
+        <w:t xml:space="preserve"> statistiques du jour </w:t>
+      </w:r>
+      <w:r>
+        <w:t>/</w:t>
+      </w:r>
+      <w:r>
+        <w:t xml:space="preserve"> historique des transactions. </w:t>
+      </w:r>
+    </w:p>
+    <w:p>
+      <w:pPr>
+        <w:pStyle w:val="Retraitcorpsdetexte"/>
+      </w:pPr>
+    </w:p>
+    <w:p>
+      <w:pPr>
+        <w:pStyle w:val="Retraitcorpsdetexte"/>
+      </w:pPr>
+      <w:r>
+        <w:t>4</w:t>
+      </w:r>
+      <w:r>
+        <w:t xml:space="preserve"> classes structurent le domaine : </w:t>
+      </w:r>
+    </w:p>
+    <w:p>
+      <w:pPr>
+        <w:pStyle w:val="Retraitcorpsdetexte"/>
         <w:numPr>
-          <w:ilvl w:val="5"/>
-          <w:numId w:val="16"/>
+          <w:ilvl w:val="0"/>
+          <w:numId w:val="48"/>
         </w:numPr>
       </w:pPr>
       <w:r>
-        <w:t>Ce paragraphe énumère la l</w:t>
-      </w:r>
-      <w:r>
-        <w:t xml:space="preserve">iste des difficultés potentielles de tout </w:t>
-      </w:r>
-      <w:r>
-        <w:t>ordre :</w:t>
-      </w:r>
-    </w:p>
-    <w:p>
-      <w:pPr>
-        <w:pStyle w:val="Informations"/>
+        <w:rPr>
+          <w:b/>
+          <w:bCs/>
+        </w:rPr>
+        <w:t>Parking</w:t>
+      </w:r>
+      <w:r>
+        <w:t xml:space="preserve"> (gestion des places et de l'historique)</w:t>
+      </w:r>
+    </w:p>
+    <w:p>
+      <w:pPr>
+        <w:pStyle w:val="Retraitcorpsdetexte"/>
         <w:numPr>
-          <w:ilvl w:val="6"/>
-          <w:numId w:val="16"/>
+          <w:ilvl w:val="0"/>
+          <w:numId w:val="48"/>
         </w:numPr>
       </w:pPr>
-      <w:r>
-        <w:t xml:space="preserve">Liste des </w:t>
-      </w:r>
-      <w:r>
-        <w:t>compétences</w:t>
-      </w:r>
-      <w:r>
-        <w:t xml:space="preserve"> à acquérir</w:t>
-      </w:r>
-      <w:r>
-        <w:t xml:space="preserve"> ou approfondir</w:t>
-      </w:r>
-    </w:p>
-    <w:p>
-      <w:pPr>
-        <w:pStyle w:val="Informations"/>
+      <w:proofErr w:type="spellStart"/>
+      <w:r>
+        <w:rPr>
+          <w:b/>
+          <w:bCs/>
+        </w:rPr>
+        <w:t>PlaceParking</w:t>
+      </w:r>
+      <w:proofErr w:type="spellEnd"/>
+      <w:r>
+        <w:t xml:space="preserve"> (numéro, statut libre/occupée)</w:t>
+      </w:r>
+    </w:p>
+    <w:p>
+      <w:pPr>
+        <w:pStyle w:val="Retraitcorpsdetexte"/>
         <w:numPr>
-          <w:ilvl w:val="6"/>
-          <w:numId w:val="16"/>
+          <w:ilvl w:val="0"/>
+          <w:numId w:val="48"/>
         </w:numPr>
       </w:pPr>
-      <w:r>
-        <w:t xml:space="preserve">Liste du </w:t>
-      </w:r>
-      <w:r>
-        <w:t>matériel</w:t>
-      </w:r>
-      <w:r>
-        <w:t xml:space="preserve"> à exploiter</w:t>
-      </w:r>
-    </w:p>
-    <w:p>
-      <w:pPr>
-        <w:pStyle w:val="Informations"/>
+      <w:proofErr w:type="spellStart"/>
+      <w:r>
+        <w:rPr>
+          <w:b/>
+          <w:bCs/>
+        </w:rPr>
+        <w:t>Vehicule</w:t>
+      </w:r>
+      <w:proofErr w:type="spellEnd"/>
+      <w:r>
+        <w:t xml:space="preserve"> (plaque, heure d'entrée) </w:t>
+      </w:r>
+    </w:p>
+    <w:p>
+      <w:pPr>
+        <w:pStyle w:val="Retraitcorpsdetexte"/>
         <w:numPr>
-          <w:ilvl w:val="6"/>
-          <w:numId w:val="16"/>
+          <w:ilvl w:val="0"/>
+          <w:numId w:val="48"/>
         </w:numPr>
       </w:pPr>
       <w:r>
-        <w:t>Recherche d’</w:t>
-      </w:r>
-      <w:r>
-        <w:t>information</w:t>
-      </w:r>
-      <w:r>
-        <w:t>s</w:t>
-      </w:r>
-      <w:r>
-        <w:t xml:space="preserve"> particulières</w:t>
-      </w:r>
-    </w:p>
-    <w:p>
-      <w:pPr>
-        <w:pStyle w:val="Informations"/>
-        <w:numPr>
-          <w:ilvl w:val="6"/>
-          <w:numId w:val="16"/>
-        </w:numPr>
-      </w:pPr>
-      <w:r>
-        <w:t>Gestion du travail en équipe &amp; collaboration</w:t>
-      </w:r>
-    </w:p>
-    <w:p>
-      <w:pPr>
-        <w:pStyle w:val="Informations"/>
-        <w:numPr>
-          <w:ilvl w:val="5"/>
-          <w:numId w:val="16"/>
-        </w:numPr>
-      </w:pPr>
-      <w:r>
-        <w:t>Ainsi que les s</w:t>
-      </w:r>
-      <w:r>
-        <w:t>olutions possibles</w:t>
-      </w:r>
-    </w:p>
-    <w:p>
-      <w:pPr>
-        <w:pStyle w:val="Informations"/>
-        <w:numPr>
-          <w:ilvl w:val="5"/>
-          <w:numId w:val="43"/>
-        </w:numPr>
-      </w:pPr>
-      <w:r>
-        <w:t>Si les spécifications de départ ne laissent pas de doutes sur la manière de réaliser un projet, ce chapitre ne fera que renvoyer le lecteur aux spécifications.</w:t>
-      </w:r>
+        <w:rPr>
+          <w:b/>
+          <w:bCs/>
+        </w:rPr>
+        <w:t>Ticket</w:t>
+      </w:r>
+      <w:r>
+        <w:t xml:space="preserve"> (calcul de la durée et du montant). </w:t>
+      </w:r>
+    </w:p>
+    <w:p>
+      <w:pPr>
+        <w:pStyle w:val="Retraitcorpsdetexte"/>
+        <w:ind w:left="0"/>
+      </w:pPr>
     </w:p>
     <w:p>
       <w:pPr>
         <w:pStyle w:val="Titre2"/>
       </w:pPr>
-      <w:bookmarkStart w:id="20" w:name="_Toc532179959"/>
-      <w:bookmarkStart w:id="21" w:name="_Toc165969643"/>
-      <w:bookmarkStart w:id="22" w:name="_Toc308526334"/>
-      <w:r>
-        <w:t>Document d’analyse</w:t>
-      </w:r>
-      <w:bookmarkEnd w:id="20"/>
-      <w:bookmarkEnd w:id="21"/>
-      <w:r>
-        <w:t xml:space="preserve"> et conception</w:t>
+      <w:bookmarkStart w:id="22" w:name="_Toc532179967"/>
+      <w:bookmarkStart w:id="23" w:name="_Toc165969651"/>
+      <w:bookmarkStart w:id="24" w:name="_Toc308526335"/>
+      <w:r>
+        <w:lastRenderedPageBreak/>
+        <w:t>Conception des tests</w:t>
       </w:r>
       <w:bookmarkEnd w:id="22"/>
-    </w:p>
-    <w:p>
-      <w:pPr>
-        <w:pStyle w:val="Informations"/>
-        <w:numPr>
-          <w:ilvl w:val="5"/>
-          <w:numId w:val="17"/>
-        </w:numPr>
-      </w:pPr>
-      <w:r>
-        <w:t xml:space="preserve">Ce paragraphe </w:t>
-      </w:r>
-      <w:r>
-        <w:t>décrit le fonctionnement de manière détaillée.</w:t>
-      </w:r>
-    </w:p>
-    <w:p>
-      <w:pPr>
-        <w:pStyle w:val="Informations"/>
-        <w:numPr>
-          <w:ilvl w:val="6"/>
-          <w:numId w:val="17"/>
-        </w:numPr>
-      </w:pPr>
-      <w:r>
-        <w:t>Autant que possible de manière graphique</w:t>
-      </w:r>
-      <w:r>
-        <w:t>, imagée, tableaux, etc.</w:t>
-      </w:r>
-    </w:p>
-    <w:p>
-      <w:pPr>
-        <w:pStyle w:val="Informations"/>
-        <w:numPr>
-          <w:ilvl w:val="6"/>
-          <w:numId w:val="17"/>
-        </w:numPr>
-      </w:pPr>
-      <w:r>
-        <w:t>Tous les cas particuliers devraient y être spécifiés</w:t>
-      </w:r>
-      <w:r>
-        <w:t>…</w:t>
-      </w:r>
-    </w:p>
-    <w:p>
-      <w:pPr>
-        <w:pStyle w:val="Informations"/>
-        <w:numPr>
-          <w:ilvl w:val="5"/>
-          <w:numId w:val="17"/>
-        </w:numPr>
-      </w:pPr>
-      <w:r>
-        <w:t>Il s’agit d’y présenter le</w:t>
-      </w:r>
-      <w:r>
-        <w:t>s fonctionnalités à développer :</w:t>
-      </w:r>
-    </w:p>
-    <w:p>
-      <w:pPr>
-        <w:pStyle w:val="Informations"/>
-        <w:numPr>
-          <w:ilvl w:val="6"/>
-          <w:numId w:val="17"/>
-        </w:numPr>
-      </w:pPr>
-      <w:r>
-        <w:t>Découpage en étapes, en modules, en fonctionnalités, etc.</w:t>
-      </w:r>
-    </w:p>
-    <w:p>
-      <w:pPr>
-        <w:pStyle w:val="Informations"/>
-        <w:numPr>
-          <w:ilvl w:val="6"/>
-          <w:numId w:val="17"/>
-        </w:numPr>
-      </w:pPr>
-      <w:r>
-        <w:t>Formulaires, interfaces graphiques, pages web, etc.</w:t>
-      </w:r>
-    </w:p>
-    <w:p>
-      <w:pPr>
-        <w:pStyle w:val="Informations"/>
-        <w:numPr>
-          <w:ilvl w:val="6"/>
-          <w:numId w:val="17"/>
-        </w:numPr>
-      </w:pPr>
-      <w:r>
-        <w:t xml:space="preserve">Schémas de navigation, schémas événementiels, structogramme, </w:t>
-      </w:r>
-      <w:r>
-        <w:t>pseudocode</w:t>
-      </w:r>
-      <w:r>
-        <w:t>, etc.</w:t>
-      </w:r>
-    </w:p>
-    <w:p>
-      <w:pPr>
-        <w:pStyle w:val="Informations"/>
-        <w:numPr>
-          <w:ilvl w:val="5"/>
-          <w:numId w:val="17"/>
-        </w:numPr>
-      </w:pPr>
-      <w:r>
-        <w:t>Si le pr</w:t>
-      </w:r>
-      <w:r>
-        <w:t xml:space="preserve">ojet inclut une base </w:t>
-      </w:r>
-      <w:r>
-        <w:t>de données :</w:t>
-      </w:r>
-    </w:p>
-    <w:p>
-      <w:pPr>
-        <w:pStyle w:val="Informations"/>
-        <w:numPr>
-          <w:ilvl w:val="6"/>
-          <w:numId w:val="17"/>
-        </w:numPr>
-      </w:pPr>
-      <w:r>
-        <w:t>Dictionnaire</w:t>
-      </w:r>
-      <w:r>
-        <w:t xml:space="preserve"> des données</w:t>
-      </w:r>
-    </w:p>
-    <w:p>
-      <w:pPr>
-        <w:pStyle w:val="Informations"/>
-        <w:numPr>
-          <w:ilvl w:val="6"/>
-          <w:numId w:val="17"/>
-        </w:numPr>
-      </w:pPr>
-      <w:r>
-        <w:t>Modèle conceptuel des données, modèles logique des données.</w:t>
-      </w:r>
-    </w:p>
-    <w:p>
-      <w:pPr>
-        <w:pStyle w:val="Titre2"/>
-      </w:pPr>
-      <w:bookmarkStart w:id="23" w:name="_Toc532179967"/>
-      <w:bookmarkStart w:id="24" w:name="_Toc165969651"/>
-      <w:bookmarkStart w:id="25" w:name="_Toc308526335"/>
-      <w:r>
-        <w:t>Conception des tests</w:t>
-      </w:r>
       <w:bookmarkEnd w:id="23"/>
       <w:bookmarkEnd w:id="24"/>
+    </w:p>
+    <w:p>
+      <w:pPr>
+        <w:pStyle w:val="Retraitcorpsdetexte"/>
+      </w:pPr>
+      <w:r>
+        <w:t xml:space="preserve">Les tests sont </w:t>
+      </w:r>
+      <w:r>
+        <w:t>faits</w:t>
+      </w:r>
+      <w:r>
+        <w:t xml:space="preserve"> chaque semaine. Ils </w:t>
+      </w:r>
+      <w:r>
+        <w:t>servent</w:t>
+      </w:r>
+      <w:r>
+        <w:t xml:space="preserve"> principalement : la validation du format de plaque, le calcul du montant selon la durée, la cohérence de l'état du parking après entrée/sortie. Les cas limites (parking plein, plaque en double, place inexistante) sont testés avec une phase de tests globaux prévue en semaine 7.</w:t>
+      </w:r>
+    </w:p>
+    <w:p>
+      <w:pPr>
+        <w:pStyle w:val="Titre1"/>
+      </w:pPr>
+      <w:bookmarkStart w:id="25" w:name="_Toc532179964"/>
+      <w:bookmarkStart w:id="26" w:name="_Toc165969648"/>
+      <w:bookmarkStart w:id="27" w:name="_Toc308526337"/>
+      <w:r>
+        <w:t>Réalisation</w:t>
+      </w:r>
       <w:bookmarkEnd w:id="25"/>
-    </w:p>
-    <w:p>
-      <w:pPr>
-        <w:pStyle w:val="Informations"/>
-        <w:numPr>
-          <w:ilvl w:val="5"/>
-          <w:numId w:val="18"/>
-        </w:numPr>
-      </w:pPr>
-      <w:r>
-        <w:t xml:space="preserve">Ce paragraphe permet de spécifier la stratégie de </w:t>
-      </w:r>
-      <w:r>
-        <w:t>test </w:t>
-      </w:r>
-      <w:r>
-        <w:t xml:space="preserve">qui sera menée au point </w:t>
-      </w:r>
-      <w:r>
-        <w:fldChar w:fldCharType="begin"/>
-      </w:r>
-      <w:r>
-        <w:instrText xml:space="preserve"> REF _Ref308525868 \r \h </w:instrText>
-      </w:r>
-      <w:r>
-        <w:fldChar w:fldCharType="separate"/>
-      </w:r>
-      <w:r>
-        <w:t>5.1</w:t>
-      </w:r>
-      <w:r>
-        <w:fldChar w:fldCharType="end"/>
-      </w:r>
-    </w:p>
-    <w:p>
-      <w:pPr>
-        <w:pStyle w:val="Informations"/>
-        <w:numPr>
-          <w:ilvl w:val="5"/>
-          <w:numId w:val="18"/>
-        </w:numPr>
-      </w:pPr>
-      <w:r>
-        <w:t>Qui, quand, avec quelles données, dans quel ordre, etc.</w:t>
-      </w:r>
-    </w:p>
-    <w:p>
-      <w:pPr>
-        <w:pStyle w:val="Titre1"/>
-      </w:pPr>
-      <w:bookmarkStart w:id="26" w:name="_Toc532179964"/>
-      <w:bookmarkStart w:id="27" w:name="_Toc165969648"/>
-      <w:bookmarkStart w:id="28" w:name="_Toc308526337"/>
-      <w:r>
-        <w:t>Réalisation</w:t>
-      </w:r>
       <w:bookmarkEnd w:id="26"/>
       <w:bookmarkEnd w:id="27"/>
+    </w:p>
+    <w:p>
+      <w:pPr>
+        <w:pStyle w:val="Titre2"/>
+      </w:pPr>
+      <w:bookmarkStart w:id="28" w:name="_Toc532179965"/>
+      <w:bookmarkStart w:id="29" w:name="_Toc165969649"/>
+      <w:bookmarkStart w:id="30" w:name="_Toc308526338"/>
+      <w:r>
+        <w:t>Dossier de Réalisation</w:t>
+      </w:r>
       <w:bookmarkEnd w:id="28"/>
-    </w:p>
-    <w:p>
-      <w:pPr>
-        <w:pStyle w:val="Titre2"/>
-      </w:pPr>
-      <w:bookmarkStart w:id="29" w:name="_Toc532179965"/>
-      <w:bookmarkStart w:id="30" w:name="_Toc165969649"/>
-      <w:bookmarkStart w:id="31" w:name="_Toc308526338"/>
-      <w:r>
-        <w:t>Dossier de Réalisation</w:t>
-      </w:r>
       <w:bookmarkEnd w:id="29"/>
       <w:bookmarkEnd w:id="30"/>
-      <w:bookmarkEnd w:id="31"/>
     </w:p>
     <w:p>
       <w:pPr>
@@ -5401,15 +5483,15 @@
       <w:pPr>
         <w:pStyle w:val="Titre2"/>
       </w:pPr>
-      <w:bookmarkStart w:id="32" w:name="_Toc532179960"/>
-      <w:bookmarkStart w:id="33" w:name="_Toc165969644"/>
-      <w:bookmarkStart w:id="34" w:name="_Toc308526339"/>
+      <w:bookmarkStart w:id="31" w:name="_Toc532179960"/>
+      <w:bookmarkStart w:id="32" w:name="_Toc165969644"/>
+      <w:bookmarkStart w:id="33" w:name="_Toc308526339"/>
       <w:r>
         <w:t>Modifications</w:t>
       </w:r>
+      <w:bookmarkEnd w:id="31"/>
       <w:bookmarkEnd w:id="32"/>
       <w:bookmarkEnd w:id="33"/>
-      <w:bookmarkEnd w:id="34"/>
     </w:p>
     <w:p>
       <w:pPr>
@@ -5451,31 +5533,31 @@
       <w:pPr>
         <w:pStyle w:val="Titre1"/>
       </w:pPr>
-      <w:bookmarkStart w:id="35" w:name="_Toc532179966"/>
-      <w:bookmarkStart w:id="36" w:name="_Toc165969650"/>
-      <w:bookmarkStart w:id="37" w:name="_Toc308526340"/>
+      <w:bookmarkStart w:id="34" w:name="_Toc532179966"/>
+      <w:bookmarkStart w:id="35" w:name="_Toc165969650"/>
+      <w:bookmarkStart w:id="36" w:name="_Toc308526340"/>
       <w:r>
         <w:t>Tests</w:t>
       </w:r>
+      <w:bookmarkEnd w:id="34"/>
       <w:bookmarkEnd w:id="35"/>
       <w:bookmarkEnd w:id="36"/>
+    </w:p>
+    <w:p>
+      <w:pPr>
+        <w:pStyle w:val="Titre2"/>
+      </w:pPr>
+      <w:bookmarkStart w:id="37" w:name="_Toc532179968"/>
+      <w:bookmarkStart w:id="38" w:name="_Toc165969652"/>
+      <w:bookmarkStart w:id="39" w:name="_Ref308525868"/>
+      <w:bookmarkStart w:id="40" w:name="_Toc308526341"/>
+      <w:r>
+        <w:t>Dossier des tests</w:t>
+      </w:r>
       <w:bookmarkEnd w:id="37"/>
-    </w:p>
-    <w:p>
-      <w:pPr>
-        <w:pStyle w:val="Titre2"/>
-      </w:pPr>
-      <w:bookmarkStart w:id="38" w:name="_Toc532179968"/>
-      <w:bookmarkStart w:id="39" w:name="_Toc165969652"/>
-      <w:bookmarkStart w:id="40" w:name="_Ref308525868"/>
-      <w:bookmarkStart w:id="41" w:name="_Toc308526341"/>
-      <w:r>
-        <w:t>Dossier des tests</w:t>
-      </w:r>
       <w:bookmarkEnd w:id="38"/>
       <w:bookmarkEnd w:id="39"/>
       <w:bookmarkEnd w:id="40"/>
-      <w:bookmarkEnd w:id="41"/>
     </w:p>
     <w:p>
       <w:pPr>
@@ -5562,29 +5644,28 @@
       <w:pPr>
         <w:pStyle w:val="Titre1"/>
       </w:pPr>
-      <w:bookmarkStart w:id="42" w:name="_Toc165969653"/>
-      <w:bookmarkStart w:id="43" w:name="_Toc308526342"/>
-      <w:r>
-        <w:lastRenderedPageBreak/>
+      <w:bookmarkStart w:id="41" w:name="_Toc165969653"/>
+      <w:bookmarkStart w:id="42" w:name="_Toc308526342"/>
+      <w:r>
         <w:t>Conclusion</w:t>
       </w:r>
+      <w:bookmarkEnd w:id="41"/>
       <w:bookmarkEnd w:id="42"/>
+    </w:p>
+    <w:p>
+      <w:pPr>
+        <w:pStyle w:val="Titre2"/>
+      </w:pPr>
+      <w:bookmarkStart w:id="43" w:name="_Toc165969654"/>
+      <w:bookmarkStart w:id="44" w:name="_Toc308526343"/>
+      <w:r>
+        <w:t xml:space="preserve">Bilan des </w:t>
+      </w:r>
       <w:bookmarkEnd w:id="43"/>
-    </w:p>
-    <w:p>
-      <w:pPr>
-        <w:pStyle w:val="Titre2"/>
-      </w:pPr>
-      <w:bookmarkStart w:id="44" w:name="_Toc165969654"/>
-      <w:bookmarkStart w:id="45" w:name="_Toc308526343"/>
-      <w:r>
-        <w:t xml:space="preserve">Bilan des </w:t>
+      <w:r>
+        <w:t>fonctionnalités demandées</w:t>
       </w:r>
       <w:bookmarkEnd w:id="44"/>
-      <w:r>
-        <w:t>fonctionnalités demandées</w:t>
-      </w:r>
-      <w:bookmarkEnd w:id="45"/>
     </w:p>
     <w:p>
       <w:pPr>
@@ -5623,13 +5704,13 @@
       <w:pPr>
         <w:pStyle w:val="Titre2"/>
       </w:pPr>
-      <w:bookmarkStart w:id="46" w:name="_Toc165969655"/>
-      <w:bookmarkStart w:id="47" w:name="_Toc308526344"/>
+      <w:bookmarkStart w:id="45" w:name="_Toc165969655"/>
+      <w:bookmarkStart w:id="46" w:name="_Toc308526344"/>
       <w:r>
         <w:t>Bilan de la planification</w:t>
       </w:r>
+      <w:bookmarkEnd w:id="45"/>
       <w:bookmarkEnd w:id="46"/>
-      <w:bookmarkEnd w:id="47"/>
     </w:p>
     <w:p>
       <w:pPr>
@@ -5670,13 +5751,13 @@
       <w:pPr>
         <w:pStyle w:val="Titre2"/>
       </w:pPr>
-      <w:bookmarkStart w:id="48" w:name="_Toc165969656"/>
-      <w:bookmarkStart w:id="49" w:name="_Toc308526345"/>
+      <w:bookmarkStart w:id="47" w:name="_Toc165969656"/>
+      <w:bookmarkStart w:id="48" w:name="_Toc308526345"/>
       <w:r>
         <w:t>Bilan personnel</w:t>
       </w:r>
+      <w:bookmarkEnd w:id="47"/>
       <w:bookmarkEnd w:id="48"/>
-      <w:bookmarkEnd w:id="49"/>
     </w:p>
     <w:p>
       <w:pPr>
@@ -5778,29 +5859,30 @@
       <w:pPr>
         <w:pStyle w:val="Titre1"/>
       </w:pPr>
-      <w:bookmarkStart w:id="50" w:name="_Toc532179971"/>
-      <w:bookmarkStart w:id="51" w:name="_Toc165969657"/>
-      <w:bookmarkStart w:id="52" w:name="_Toc308526346"/>
-      <w:r>
+      <w:bookmarkStart w:id="49" w:name="_Toc532179971"/>
+      <w:bookmarkStart w:id="50" w:name="_Toc165969657"/>
+      <w:bookmarkStart w:id="51" w:name="_Toc308526346"/>
+      <w:r>
+        <w:lastRenderedPageBreak/>
         <w:t>Divers</w:t>
       </w:r>
+      <w:bookmarkEnd w:id="49"/>
       <w:bookmarkEnd w:id="50"/>
       <w:bookmarkEnd w:id="51"/>
+    </w:p>
+    <w:p>
+      <w:pPr>
+        <w:pStyle w:val="Titre2"/>
+      </w:pPr>
+      <w:bookmarkStart w:id="52" w:name="_Toc532179972"/>
+      <w:bookmarkStart w:id="53" w:name="_Toc165969658"/>
+      <w:bookmarkStart w:id="54" w:name="_Toc308526347"/>
+      <w:r>
+        <w:t>Journal de travail</w:t>
+      </w:r>
       <w:bookmarkEnd w:id="52"/>
-    </w:p>
-    <w:p>
-      <w:pPr>
-        <w:pStyle w:val="Titre2"/>
-      </w:pPr>
-      <w:bookmarkStart w:id="53" w:name="_Toc532179972"/>
-      <w:bookmarkStart w:id="54" w:name="_Toc165969658"/>
-      <w:bookmarkStart w:id="55" w:name="_Toc308526347"/>
-      <w:r>
-        <w:t>Journal de travail</w:t>
-      </w:r>
       <w:bookmarkEnd w:id="53"/>
       <w:bookmarkEnd w:id="54"/>
-      <w:bookmarkEnd w:id="55"/>
     </w:p>
     <w:p>
       <w:pPr>
@@ -5836,11 +5918,11 @@
       <w:pPr>
         <w:pStyle w:val="Titre2"/>
       </w:pPr>
-      <w:bookmarkStart w:id="56" w:name="_Toc308526348"/>
+      <w:bookmarkStart w:id="55" w:name="_Toc308526348"/>
       <w:r>
         <w:t>Bibliographie</w:t>
       </w:r>
-      <w:bookmarkEnd w:id="56"/>
+      <w:bookmarkEnd w:id="55"/>
     </w:p>
     <w:p>
       <w:pPr>
@@ -5867,11 +5949,11 @@
       <w:pPr>
         <w:pStyle w:val="Titre2"/>
       </w:pPr>
-      <w:bookmarkStart w:id="57" w:name="_Toc308526349"/>
+      <w:bookmarkStart w:id="56" w:name="_Toc308526349"/>
       <w:r>
         <w:t>Webographie</w:t>
       </w:r>
-      <w:bookmarkEnd w:id="57"/>
+      <w:bookmarkEnd w:id="56"/>
     </w:p>
     <w:p>
       <w:pPr>
@@ -5889,11 +5971,11 @@
       <w:pPr>
         <w:pStyle w:val="Titre1"/>
       </w:pPr>
-      <w:bookmarkStart w:id="58" w:name="_Toc308526350"/>
+      <w:bookmarkStart w:id="57" w:name="_Toc308526350"/>
       <w:r>
         <w:t>Annexes</w:t>
       </w:r>
-      <w:bookmarkEnd w:id="58"/>
+      <w:bookmarkEnd w:id="57"/>
     </w:p>
     <w:p>
       <w:pPr>
@@ -5968,8 +6050,8 @@
       </w:r>
     </w:p>
     <w:sectPr>
-      <w:headerReference w:type="default" r:id="rId12"/>
-      <w:footerReference w:type="default" r:id="rId13"/>
+      <w:headerReference w:type="default" r:id="rId16"/>
+      <w:footerReference w:type="default" r:id="rId17"/>
       <w:pgSz w:w="11906" w:h="16838" w:code="9"/>
       <w:pgMar w:top="1418" w:right="1418" w:bottom="1418" w:left="1418" w:header="709" w:footer="709" w:gutter="0"/>
       <w:cols w:space="708"/>

</xml_diff>

<commit_message>
Doc : rapport de fichier
</commit_message>
<xml_diff>
--- a/T-P_OO-Rapport de projet.docx
+++ b/T-P_OO-Rapport de projet.docx
@@ -3471,15 +3471,10 @@
       <w:r>
         <w:t>itr</w:t>
       </w:r>
+      <w:bookmarkEnd w:id="3"/>
       <w:r>
         <w:t>e</w:t>
       </w:r>
-      <w:bookmarkEnd w:id="3"/>
-    </w:p>
-    <w:p>
-      <w:pPr>
-        <w:pStyle w:val="Retraitcorpsdetexte"/>
-      </w:pPr>
     </w:p>
     <w:p>
       <w:pPr>
@@ -3510,11 +3505,6 @@
     <w:p>
       <w:pPr>
         <w:pStyle w:val="Retraitcorpsdetexte"/>
-      </w:pPr>
-    </w:p>
-    <w:p>
-      <w:pPr>
-        <w:pStyle w:val="Retraitcorpsdetexte"/>
         <w:rPr>
           <w:sz w:val="22"/>
           <w:szCs w:val="22"/>
@@ -3541,11 +3531,6 @@
     <w:p>
       <w:pPr>
         <w:pStyle w:val="Retraitcorpsdetexte"/>
-      </w:pPr>
-    </w:p>
-    <w:p>
-      <w:pPr>
-        <w:pStyle w:val="Retraitcorpsdetexte"/>
         <w:rPr>
           <w:sz w:val="22"/>
           <w:szCs w:val="22"/>
@@ -3601,15 +3586,6 @@
         <w:t>rérequis</w:t>
       </w:r>
       <w:bookmarkEnd w:id="8"/>
-    </w:p>
-    <w:p>
-      <w:pPr>
-        <w:pStyle w:val="Retraitcorpsdetexte"/>
-        <w:rPr>
-          <w:sz w:val="22"/>
-          <w:szCs w:val="22"/>
-        </w:rPr>
-      </w:pPr>
     </w:p>
     <w:p>
       <w:pPr>
@@ -4053,41 +4029,10 @@
     </w:p>
     <w:p>
       <w:pPr>
-        <w:pStyle w:val="Retraitcorpsdetexte3"/>
-      </w:pPr>
-    </w:p>
-    <w:p>
-      <w:pPr>
-        <w:pStyle w:val="Retraitcorpsdetexte3"/>
-      </w:pPr>
-    </w:p>
-    <w:p>
-      <w:pPr>
-        <w:pStyle w:val="Retraitcorpsdetexte3"/>
-      </w:pPr>
-    </w:p>
-    <w:p>
-      <w:pPr>
-        <w:pStyle w:val="Retraitcorpsdetexte3"/>
-      </w:pPr>
-    </w:p>
-    <w:p>
-      <w:pPr>
-        <w:pStyle w:val="Retraitcorpsdetexte3"/>
-      </w:pPr>
-    </w:p>
-    <w:p>
-      <w:pPr>
-        <w:pStyle w:val="Retraitcorpsdetexte3"/>
-      </w:pPr>
-    </w:p>
-    <w:p>
-      <w:pPr>
         <w:pStyle w:val="Titre3"/>
       </w:pPr>
       <w:bookmarkStart w:id="10" w:name="_Toc308526325"/>
       <w:r>
-        <w:lastRenderedPageBreak/>
         <w:t>Contraintes</w:t>
       </w:r>
       <w:bookmarkEnd w:id="10"/>
@@ -4478,7 +4423,6 @@
       </w:pPr>
       <w:proofErr w:type="gramStart"/>
       <w:r>
-        <w:lastRenderedPageBreak/>
         <w:t>rechercher</w:t>
       </w:r>
       <w:proofErr w:type="gramEnd"/>
@@ -4573,13 +4517,8 @@
         <w:pStyle w:val="Retraitcorpsdetexte3"/>
       </w:pPr>
       <w:r>
-        <w:t xml:space="preserve">Afficher </w:t>
-      </w:r>
-      <w:r>
-        <w:t>les transactions effectuées</w:t>
-      </w:r>
-      <w:r>
-        <w:t xml:space="preserve"> :</w:t>
+        <w:lastRenderedPageBreak/>
+        <w:t>Afficher les transactions effectuées :</w:t>
       </w:r>
     </w:p>
     <w:p>
@@ -4825,7 +4764,6 @@
         <w:pStyle w:val="Titre1"/>
       </w:pPr>
       <w:r>
-        <w:lastRenderedPageBreak/>
         <w:t>Planification</w:t>
       </w:r>
     </w:p>
@@ -4834,12 +4772,18 @@
         <w:pStyle w:val="Retraitcorpsdetexte"/>
         <w:ind w:left="567"/>
       </w:pPr>
+    </w:p>
+    <w:p>
+      <w:pPr>
+        <w:pStyle w:val="Retraitcorpsdetexte"/>
+        <w:ind w:left="567"/>
+      </w:pPr>
       <w:r>
         <w:drawing>
-          <wp:inline distT="0" distB="0" distL="0" distR="0" wp14:anchorId="1BD54B54" wp14:editId="22A179F3">
-            <wp:extent cx="5749925" cy="2874963"/>
-            <wp:effectExtent l="0" t="0" r="3175" b="1905"/>
-            <wp:docPr id="776281169" name="Image 1"/>
+          <wp:inline distT="0" distB="0" distL="0" distR="0" wp14:anchorId="59B79835" wp14:editId="1F10771A">
+            <wp:extent cx="5759450" cy="2892425"/>
+            <wp:effectExtent l="0" t="0" r="0" b="3175"/>
+            <wp:docPr id="656573585" name="Image 1"/>
             <wp:cNvGraphicFramePr>
               <a:graphicFrameLocks xmlns:a="http://schemas.openxmlformats.org/drawingml/2006/main" noChangeAspect="1"/>
             </wp:cNvGraphicFramePr>
@@ -4847,7 +4791,7 @@
               <a:graphicData uri="http://schemas.openxmlformats.org/drawingml/2006/picture">
                 <pic:pic xmlns:pic="http://schemas.openxmlformats.org/drawingml/2006/picture">
                   <pic:nvPicPr>
-                    <pic:cNvPr id="776281169" name=""/>
+                    <pic:cNvPr id="656573585" name=""/>
                     <pic:cNvPicPr/>
                   </pic:nvPicPr>
                   <pic:blipFill>
@@ -4859,7 +4803,7 @@
                   <pic:spPr>
                     <a:xfrm>
                       <a:off x="0" y="0"/>
-                      <a:ext cx="5752455" cy="2876228"/>
+                      <a:ext cx="5759450" cy="2892425"/>
                     </a:xfrm>
                     <a:prstGeom prst="rect">
                       <a:avLst/>
@@ -4878,11 +4822,12 @@
         <w:ind w:left="567"/>
       </w:pPr>
       <w:r>
+        <w:lastRenderedPageBreak/>
         <w:drawing>
-          <wp:inline distT="0" distB="0" distL="0" distR="0" wp14:anchorId="04CA243C" wp14:editId="305FC36D">
+          <wp:inline distT="0" distB="0" distL="0" distR="0" wp14:anchorId="4CCD883A" wp14:editId="04F486A1">
             <wp:extent cx="5759450" cy="2877185"/>
             <wp:effectExtent l="0" t="0" r="0" b="0"/>
-            <wp:docPr id="462581419" name="Image 1"/>
+            <wp:docPr id="1721205633" name="Image 1"/>
             <wp:cNvGraphicFramePr>
               <a:graphicFrameLocks xmlns:a="http://schemas.openxmlformats.org/drawingml/2006/main" noChangeAspect="1"/>
             </wp:cNvGraphicFramePr>
@@ -4890,7 +4835,7 @@
               <a:graphicData uri="http://schemas.openxmlformats.org/drawingml/2006/picture">
                 <pic:pic xmlns:pic="http://schemas.openxmlformats.org/drawingml/2006/picture">
                   <pic:nvPicPr>
-                    <pic:cNvPr id="462581419" name=""/>
+                    <pic:cNvPr id="1721205633" name=""/>
                     <pic:cNvPicPr/>
                   </pic:nvPicPr>
                   <pic:blipFill>
@@ -4921,12 +4866,11 @@
         <w:ind w:left="567"/>
       </w:pPr>
       <w:r>
-        <w:lastRenderedPageBreak/>
         <w:drawing>
-          <wp:inline distT="0" distB="0" distL="0" distR="0" wp14:anchorId="59CEE6C6" wp14:editId="7E58453F">
-            <wp:extent cx="5759450" cy="2887345"/>
-            <wp:effectExtent l="0" t="0" r="0" b="8255"/>
-            <wp:docPr id="1735724347" name="Image 1"/>
+          <wp:inline distT="0" distB="0" distL="0" distR="0" wp14:anchorId="60EA4120" wp14:editId="7F0019DA">
+            <wp:extent cx="5759450" cy="2869565"/>
+            <wp:effectExtent l="0" t="0" r="0" b="6985"/>
+            <wp:docPr id="1089008533" name="Image 1"/>
             <wp:cNvGraphicFramePr>
               <a:graphicFrameLocks xmlns:a="http://schemas.openxmlformats.org/drawingml/2006/main" noChangeAspect="1"/>
             </wp:cNvGraphicFramePr>
@@ -4934,54 +4878,11 @@
               <a:graphicData uri="http://schemas.openxmlformats.org/drawingml/2006/picture">
                 <pic:pic xmlns:pic="http://schemas.openxmlformats.org/drawingml/2006/picture">
                   <pic:nvPicPr>
-                    <pic:cNvPr id="1735724347" name=""/>
+                    <pic:cNvPr id="1089008533" name=""/>
                     <pic:cNvPicPr/>
                   </pic:nvPicPr>
                   <pic:blipFill>
                     <a:blip r:embed="rId14"/>
-                    <a:stretch>
-                      <a:fillRect/>
-                    </a:stretch>
-                  </pic:blipFill>
-                  <pic:spPr>
-                    <a:xfrm>
-                      <a:off x="0" y="0"/>
-                      <a:ext cx="5759450" cy="2887345"/>
-                    </a:xfrm>
-                    <a:prstGeom prst="rect">
-                      <a:avLst/>
-                    </a:prstGeom>
-                  </pic:spPr>
-                </pic:pic>
-              </a:graphicData>
-            </a:graphic>
-          </wp:inline>
-        </w:drawing>
-      </w:r>
-    </w:p>
-    <w:p>
-      <w:pPr>
-        <w:pStyle w:val="Retraitcorpsdetexte"/>
-        <w:ind w:left="567"/>
-      </w:pPr>
-      <w:r>
-        <w:drawing>
-          <wp:inline distT="0" distB="0" distL="0" distR="0" wp14:anchorId="65AF408D" wp14:editId="276C29B5">
-            <wp:extent cx="5759450" cy="2869565"/>
-            <wp:effectExtent l="0" t="0" r="0" b="6985"/>
-            <wp:docPr id="910455874" name="Image 1"/>
-            <wp:cNvGraphicFramePr>
-              <a:graphicFrameLocks xmlns:a="http://schemas.openxmlformats.org/drawingml/2006/main" noChangeAspect="1"/>
-            </wp:cNvGraphicFramePr>
-            <a:graphic xmlns:a="http://schemas.openxmlformats.org/drawingml/2006/main">
-              <a:graphicData uri="http://schemas.openxmlformats.org/drawingml/2006/picture">
-                <pic:pic xmlns:pic="http://schemas.openxmlformats.org/drawingml/2006/picture">
-                  <pic:nvPicPr>
-                    <pic:cNvPr id="910455874" name=""/>
-                    <pic:cNvPicPr/>
-                  </pic:nvPicPr>
-                  <pic:blipFill>
-                    <a:blip r:embed="rId15"/>
                     <a:stretch>
                       <a:fillRect/>
                     </a:stretch>
@@ -5005,7 +4906,48 @@
     <w:p>
       <w:pPr>
         <w:pStyle w:val="Retraitcorpsdetexte"/>
-      </w:pPr>
+        <w:ind w:left="567"/>
+      </w:pPr>
+      <w:r>
+        <w:t xml:space="preserve">          </w:t>
+      </w:r>
+      <w:r>
+        <w:drawing>
+          <wp:inline distT="0" distB="0" distL="0" distR="0" wp14:anchorId="2C2019DB" wp14:editId="51C4E520">
+            <wp:extent cx="5759450" cy="2867025"/>
+            <wp:effectExtent l="0" t="0" r="0" b="9525"/>
+            <wp:docPr id="2021267806" name="Image 1"/>
+            <wp:cNvGraphicFramePr>
+              <a:graphicFrameLocks xmlns:a="http://schemas.openxmlformats.org/drawingml/2006/main" noChangeAspect="1"/>
+            </wp:cNvGraphicFramePr>
+            <a:graphic xmlns:a="http://schemas.openxmlformats.org/drawingml/2006/main">
+              <a:graphicData uri="http://schemas.openxmlformats.org/drawingml/2006/picture">
+                <pic:pic xmlns:pic="http://schemas.openxmlformats.org/drawingml/2006/picture">
+                  <pic:nvPicPr>
+                    <pic:cNvPr id="2021267806" name=""/>
+                    <pic:cNvPicPr/>
+                  </pic:nvPicPr>
+                  <pic:blipFill>
+                    <a:blip r:embed="rId15"/>
+                    <a:stretch>
+                      <a:fillRect/>
+                    </a:stretch>
+                  </pic:blipFill>
+                  <pic:spPr>
+                    <a:xfrm>
+                      <a:off x="0" y="0"/>
+                      <a:ext cx="5759450" cy="2867025"/>
+                    </a:xfrm>
+                    <a:prstGeom prst="rect">
+                      <a:avLst/>
+                    </a:prstGeom>
+                  </pic:spPr>
+                </pic:pic>
+              </a:graphicData>
+            </a:graphic>
+          </wp:inline>
+        </w:drawing>
+      </w:r>
     </w:p>
     <w:p>
       <w:pPr>
@@ -5017,6 +4959,7 @@
       <w:bookmarkEnd w:id="4"/>
       <w:bookmarkEnd w:id="5"/>
       <w:r>
+        <w:lastRenderedPageBreak/>
         <w:t>Analyse</w:t>
       </w:r>
       <w:bookmarkEnd w:id="15"/>
@@ -5196,6 +5139,186 @@
         <w:t xml:space="preserve"> (gestion des places et de l'historique)</w:t>
       </w:r>
     </w:p>
+    <w:tbl>
+      <w:tblPr>
+        <w:tblStyle w:val="Grilledutableau"/>
+        <w:tblW w:w="0" w:type="auto"/>
+        <w:tblInd w:w="2174" w:type="dxa"/>
+        <w:tblLook w:val="04A0" w:firstRow="1" w:lastRow="0" w:firstColumn="1" w:lastColumn="0" w:noHBand="0" w:noVBand="1"/>
+      </w:tblPr>
+      <w:tblGrid>
+        <w:gridCol w:w="3056"/>
+        <w:gridCol w:w="2878"/>
+      </w:tblGrid>
+      <w:tr>
+        <w:trPr>
+          <w:trHeight w:val="260"/>
+        </w:trPr>
+        <w:tc>
+          <w:tcPr>
+            <w:tcW w:w="3056" w:type="dxa"/>
+          </w:tcPr>
+          <w:p>
+            <w:pPr>
+              <w:pStyle w:val="Retraitcorpsdetexte"/>
+              <w:ind w:left="0"/>
+              <w:rPr>
+                <w:b/>
+                <w:bCs/>
+              </w:rPr>
+            </w:pPr>
+            <w:proofErr w:type="gramStart"/>
+            <w:r>
+              <w:rPr>
+                <w:b/>
+                <w:bCs/>
+              </w:rPr>
+              <w:t>classe</w:t>
+            </w:r>
+            <w:proofErr w:type="gramEnd"/>
+          </w:p>
+        </w:tc>
+        <w:tc>
+          <w:tcPr>
+            <w:tcW w:w="2878" w:type="dxa"/>
+          </w:tcPr>
+          <w:p>
+            <w:pPr>
+              <w:pStyle w:val="Retraitcorpsdetexte"/>
+              <w:ind w:left="0"/>
+              <w:rPr>
+                <w:b/>
+                <w:bCs/>
+              </w:rPr>
+            </w:pPr>
+            <w:proofErr w:type="spellStart"/>
+            <w:proofErr w:type="gramStart"/>
+            <w:r>
+              <w:rPr>
+                <w:b/>
+                <w:bCs/>
+              </w:rPr>
+              <w:t>attribu</w:t>
+            </w:r>
+            <w:proofErr w:type="spellEnd"/>
+            <w:proofErr w:type="gramEnd"/>
+          </w:p>
+        </w:tc>
+      </w:tr>
+      <w:tr>
+        <w:trPr>
+          <w:trHeight w:val="260"/>
+        </w:trPr>
+        <w:tc>
+          <w:tcPr>
+            <w:tcW w:w="3056" w:type="dxa"/>
+          </w:tcPr>
+          <w:p>
+            <w:pPr>
+              <w:pStyle w:val="Retraitcorpsdetexte"/>
+              <w:ind w:left="0"/>
+            </w:pPr>
+            <w:proofErr w:type="spellStart"/>
+            <w:r>
+              <w:t>PlaceParking</w:t>
+            </w:r>
+            <w:proofErr w:type="spellEnd"/>
+          </w:p>
+        </w:tc>
+        <w:tc>
+          <w:tcPr>
+            <w:tcW w:w="2878" w:type="dxa"/>
+          </w:tcPr>
+          <w:p>
+            <w:pPr>
+              <w:pStyle w:val="Retraitcorpsdetexte"/>
+              <w:ind w:left="0"/>
+            </w:pPr>
+            <w:r>
+              <w:t>&lt;</w:t>
+            </w:r>
+            <w:proofErr w:type="spellStart"/>
+            <w:proofErr w:type="gramStart"/>
+            <w:r>
+              <w:t>list</w:t>
+            </w:r>
+            <w:proofErr w:type="spellEnd"/>
+            <w:proofErr w:type="gramEnd"/>
+            <w:r>
+              <w:t>&gt;</w:t>
+            </w:r>
+            <w:proofErr w:type="spellStart"/>
+            <w:r>
+              <w:t>placeparking</w:t>
+            </w:r>
+            <w:proofErr w:type="spellEnd"/>
+          </w:p>
+        </w:tc>
+      </w:tr>
+      <w:tr>
+        <w:trPr>
+          <w:trHeight w:val="260"/>
+        </w:trPr>
+        <w:tc>
+          <w:tcPr>
+            <w:tcW w:w="3056" w:type="dxa"/>
+          </w:tcPr>
+          <w:p>
+            <w:pPr>
+              <w:pStyle w:val="Retraitcorpsdetexte"/>
+              <w:ind w:left="0"/>
+            </w:pPr>
+            <w:proofErr w:type="gramStart"/>
+            <w:r>
+              <w:t>historique</w:t>
+            </w:r>
+            <w:proofErr w:type="gramEnd"/>
+          </w:p>
+        </w:tc>
+        <w:tc>
+          <w:tcPr>
+            <w:tcW w:w="2878" w:type="dxa"/>
+          </w:tcPr>
+          <w:p>
+            <w:pPr>
+              <w:pStyle w:val="Retraitcorpsdetexte"/>
+              <w:ind w:left="0"/>
+            </w:pPr>
+            <w:r>
+              <w:t>&lt;</w:t>
+            </w:r>
+            <w:proofErr w:type="gramStart"/>
+            <w:r>
+              <w:t>str</w:t>
+            </w:r>
+            <w:r>
+              <w:t>ing</w:t>
+            </w:r>
+            <w:proofErr w:type="gramEnd"/>
+            <w:r>
+              <w:t>&gt;</w:t>
+            </w:r>
+            <w:r>
+              <w:t xml:space="preserve"> log </w:t>
+            </w:r>
+            <w:proofErr w:type="spellStart"/>
+            <w:r>
+              <w:t>vehicule</w:t>
+            </w:r>
+            <w:proofErr w:type="spellEnd"/>
+            <w:r>
+              <w:t xml:space="preserve"> + ticket</w:t>
+            </w:r>
+          </w:p>
+        </w:tc>
+      </w:tr>
+    </w:tbl>
+    <w:p>
+      <w:pPr>
+        <w:pStyle w:val="Retraitcorpsdetexte"/>
+        <w:ind w:left="2174"/>
+      </w:pPr>
+    </w:p>
     <w:p>
       <w:pPr>
         <w:pStyle w:val="Retraitcorpsdetexte"/>
@@ -5214,9 +5337,176 @@
       </w:r>
       <w:proofErr w:type="spellEnd"/>
       <w:r>
-        <w:t xml:space="preserve"> (numéro, statut libre/occupée)</w:t>
-      </w:r>
-    </w:p>
+        <w:t xml:space="preserve"> (</w:t>
+      </w:r>
+      <w:r>
+        <w:t>véhicule</w:t>
+      </w:r>
+      <w:r>
+        <w:t>, statut libre/occupée)</w:t>
+      </w:r>
+    </w:p>
+    <w:tbl>
+      <w:tblPr>
+        <w:tblStyle w:val="Grilledutableau"/>
+        <w:tblW w:w="0" w:type="auto"/>
+        <w:tblInd w:w="2174" w:type="dxa"/>
+        <w:tblLook w:val="04A0" w:firstRow="1" w:lastRow="0" w:firstColumn="1" w:lastColumn="0" w:noHBand="0" w:noVBand="1"/>
+      </w:tblPr>
+      <w:tblGrid>
+        <w:gridCol w:w="3056"/>
+        <w:gridCol w:w="2878"/>
+      </w:tblGrid>
+      <w:tr>
+        <w:trPr>
+          <w:trHeight w:val="260"/>
+        </w:trPr>
+        <w:tc>
+          <w:tcPr>
+            <w:tcW w:w="3056" w:type="dxa"/>
+          </w:tcPr>
+          <w:p>
+            <w:pPr>
+              <w:pStyle w:val="Retraitcorpsdetexte"/>
+              <w:ind w:left="0"/>
+              <w:rPr>
+                <w:b/>
+                <w:bCs/>
+              </w:rPr>
+            </w:pPr>
+            <w:proofErr w:type="gramStart"/>
+            <w:r>
+              <w:rPr>
+                <w:b/>
+                <w:bCs/>
+              </w:rPr>
+              <w:t>classe</w:t>
+            </w:r>
+            <w:proofErr w:type="gramEnd"/>
+          </w:p>
+        </w:tc>
+        <w:tc>
+          <w:tcPr>
+            <w:tcW w:w="2878" w:type="dxa"/>
+          </w:tcPr>
+          <w:p>
+            <w:pPr>
+              <w:pStyle w:val="Retraitcorpsdetexte"/>
+              <w:ind w:left="0"/>
+              <w:rPr>
+                <w:b/>
+                <w:bCs/>
+              </w:rPr>
+            </w:pPr>
+            <w:proofErr w:type="spellStart"/>
+            <w:proofErr w:type="gramStart"/>
+            <w:r>
+              <w:rPr>
+                <w:b/>
+                <w:bCs/>
+              </w:rPr>
+              <w:t>attribu</w:t>
+            </w:r>
+            <w:proofErr w:type="spellEnd"/>
+            <w:proofErr w:type="gramEnd"/>
+          </w:p>
+        </w:tc>
+      </w:tr>
+      <w:tr>
+        <w:trPr>
+          <w:trHeight w:val="260"/>
+        </w:trPr>
+        <w:tc>
+          <w:tcPr>
+            <w:tcW w:w="3056" w:type="dxa"/>
+          </w:tcPr>
+          <w:p>
+            <w:pPr>
+              <w:pStyle w:val="Retraitcorpsdetexte"/>
+              <w:ind w:left="0"/>
+            </w:pPr>
+            <w:proofErr w:type="spellStart"/>
+            <w:proofErr w:type="gramStart"/>
+            <w:r>
+              <w:t>vehicule</w:t>
+            </w:r>
+            <w:proofErr w:type="spellEnd"/>
+            <w:proofErr w:type="gramEnd"/>
+          </w:p>
+        </w:tc>
+        <w:tc>
+          <w:tcPr>
+            <w:tcW w:w="2878" w:type="dxa"/>
+          </w:tcPr>
+          <w:p>
+            <w:pPr>
+              <w:pStyle w:val="Retraitcorpsdetexte"/>
+              <w:ind w:left="0"/>
+            </w:pPr>
+            <w:r>
+              <w:t>&lt;</w:t>
+            </w:r>
+            <w:proofErr w:type="spellStart"/>
+            <w:proofErr w:type="gramStart"/>
+            <w:r>
+              <w:t>vehicule</w:t>
+            </w:r>
+            <w:proofErr w:type="spellEnd"/>
+            <w:proofErr w:type="gramEnd"/>
+            <w:r>
+              <w:t>&gt;</w:t>
+            </w:r>
+          </w:p>
+        </w:tc>
+      </w:tr>
+      <w:tr>
+        <w:trPr>
+          <w:trHeight w:val="260"/>
+        </w:trPr>
+        <w:tc>
+          <w:tcPr>
+            <w:tcW w:w="3056" w:type="dxa"/>
+          </w:tcPr>
+          <w:p>
+            <w:pPr>
+              <w:pStyle w:val="Retraitcorpsdetexte"/>
+              <w:ind w:left="0"/>
+            </w:pPr>
+            <w:proofErr w:type="spellStart"/>
+            <w:proofErr w:type="gramStart"/>
+            <w:r>
+              <w:t>estOccupe</w:t>
+            </w:r>
+            <w:proofErr w:type="spellEnd"/>
+            <w:proofErr w:type="gramEnd"/>
+          </w:p>
+        </w:tc>
+        <w:tc>
+          <w:tcPr>
+            <w:tcW w:w="2878" w:type="dxa"/>
+          </w:tcPr>
+          <w:p>
+            <w:pPr>
+              <w:pStyle w:val="Retraitcorpsdetexte"/>
+              <w:ind w:left="0"/>
+            </w:pPr>
+            <w:r>
+              <w:t>&lt;</w:t>
+            </w:r>
+            <w:proofErr w:type="spellStart"/>
+            <w:proofErr w:type="gramStart"/>
+            <w:r>
+              <w:t>bool</w:t>
+            </w:r>
+            <w:proofErr w:type="spellEnd"/>
+            <w:proofErr w:type="gramEnd"/>
+            <w:r>
+              <w:t>&gt;</w:t>
+            </w:r>
+          </w:p>
+        </w:tc>
+      </w:tr>
+    </w:tbl>
     <w:p>
       <w:pPr>
         <w:pStyle w:val="Retraitcorpsdetexte"/>
@@ -5225,18 +5515,6 @@
           <w:numId w:val="48"/>
         </w:numPr>
       </w:pPr>
-      <w:proofErr w:type="spellStart"/>
-      <w:r>
-        <w:rPr>
-          <w:b/>
-          <w:bCs/>
-        </w:rPr>
-        <w:t>Vehicule</w:t>
-      </w:r>
-      <w:proofErr w:type="spellEnd"/>
-      <w:r>
-        <w:t xml:space="preserve"> (plaque, heure d'entrée) </w:t>
-      </w:r>
     </w:p>
     <w:p>
       <w:pPr>
@@ -5246,16 +5524,422 @@
           <w:numId w:val="48"/>
         </w:numPr>
       </w:pPr>
+      <w:proofErr w:type="spellStart"/>
       <w:r>
         <w:rPr>
           <w:b/>
           <w:bCs/>
         </w:rPr>
+        <w:t>Vehicule</w:t>
+      </w:r>
+      <w:proofErr w:type="spellEnd"/>
+      <w:r>
+        <w:t xml:space="preserve"> (plaque) </w:t>
+      </w:r>
+    </w:p>
+    <w:tbl>
+      <w:tblPr>
+        <w:tblStyle w:val="Grilledutableau"/>
+        <w:tblW w:w="0" w:type="auto"/>
+        <w:tblInd w:w="2174" w:type="dxa"/>
+        <w:tblLook w:val="04A0" w:firstRow="1" w:lastRow="0" w:firstColumn="1" w:lastColumn="0" w:noHBand="0" w:noVBand="1"/>
+      </w:tblPr>
+      <w:tblGrid>
+        <w:gridCol w:w="3056"/>
+        <w:gridCol w:w="2878"/>
+      </w:tblGrid>
+      <w:tr>
+        <w:trPr>
+          <w:trHeight w:val="260"/>
+        </w:trPr>
+        <w:tc>
+          <w:tcPr>
+            <w:tcW w:w="3056" w:type="dxa"/>
+          </w:tcPr>
+          <w:p>
+            <w:pPr>
+              <w:pStyle w:val="Retraitcorpsdetexte"/>
+              <w:ind w:left="0"/>
+              <w:rPr>
+                <w:b/>
+                <w:bCs/>
+              </w:rPr>
+            </w:pPr>
+            <w:proofErr w:type="gramStart"/>
+            <w:r>
+              <w:rPr>
+                <w:b/>
+                <w:bCs/>
+              </w:rPr>
+              <w:t>classe</w:t>
+            </w:r>
+            <w:proofErr w:type="gramEnd"/>
+          </w:p>
+        </w:tc>
+        <w:tc>
+          <w:tcPr>
+            <w:tcW w:w="2878" w:type="dxa"/>
+          </w:tcPr>
+          <w:p>
+            <w:pPr>
+              <w:pStyle w:val="Retraitcorpsdetexte"/>
+              <w:ind w:left="0"/>
+              <w:rPr>
+                <w:b/>
+                <w:bCs/>
+              </w:rPr>
+            </w:pPr>
+            <w:proofErr w:type="spellStart"/>
+            <w:proofErr w:type="gramStart"/>
+            <w:r>
+              <w:rPr>
+                <w:b/>
+                <w:bCs/>
+              </w:rPr>
+              <w:t>attribu</w:t>
+            </w:r>
+            <w:proofErr w:type="spellEnd"/>
+            <w:proofErr w:type="gramEnd"/>
+          </w:p>
+        </w:tc>
+      </w:tr>
+      <w:tr>
+        <w:trPr>
+          <w:trHeight w:val="260"/>
+        </w:trPr>
+        <w:tc>
+          <w:tcPr>
+            <w:tcW w:w="3056" w:type="dxa"/>
+          </w:tcPr>
+          <w:p>
+            <w:pPr>
+              <w:pStyle w:val="Retraitcorpsdetexte"/>
+              <w:ind w:left="0"/>
+            </w:pPr>
+            <w:proofErr w:type="gramStart"/>
+            <w:r>
+              <w:t>plaque</w:t>
+            </w:r>
+            <w:proofErr w:type="gramEnd"/>
+          </w:p>
+        </w:tc>
+        <w:tc>
+          <w:tcPr>
+            <w:tcW w:w="2878" w:type="dxa"/>
+          </w:tcPr>
+          <w:p>
+            <w:pPr>
+              <w:pStyle w:val="Retraitcorpsdetexte"/>
+              <w:ind w:left="0"/>
+            </w:pPr>
+            <w:r>
+              <w:t>&lt;</w:t>
+            </w:r>
+            <w:proofErr w:type="gramStart"/>
+            <w:r>
+              <w:t>string</w:t>
+            </w:r>
+            <w:proofErr w:type="gramEnd"/>
+            <w:r>
+              <w:t>&gt;</w:t>
+            </w:r>
+          </w:p>
+        </w:tc>
+      </w:tr>
+    </w:tbl>
+    <w:p>
+      <w:pPr>
+        <w:pStyle w:val="Retraitcorpsdetexte"/>
+        <w:numPr>
+          <w:ilvl w:val="0"/>
+          <w:numId w:val="48"/>
+        </w:numPr>
+      </w:pPr>
+    </w:p>
+    <w:p>
+      <w:pPr>
+        <w:pStyle w:val="Retraitcorpsdetexte"/>
+        <w:numPr>
+          <w:ilvl w:val="0"/>
+          <w:numId w:val="48"/>
+        </w:numPr>
+      </w:pPr>
+      <w:r>
+        <w:rPr>
+          <w:b/>
+          <w:bCs/>
+        </w:rPr>
         <w:t>Ticket</w:t>
       </w:r>
       <w:r>
         <w:t xml:space="preserve"> (calcul de la durée et du montant). </w:t>
       </w:r>
+    </w:p>
+    <w:tbl>
+      <w:tblPr>
+        <w:tblStyle w:val="Grilledutableau"/>
+        <w:tblW w:w="0" w:type="auto"/>
+        <w:tblInd w:w="2174" w:type="dxa"/>
+        <w:tblLook w:val="04A0" w:firstRow="1" w:lastRow="0" w:firstColumn="1" w:lastColumn="0" w:noHBand="0" w:noVBand="1"/>
+      </w:tblPr>
+      <w:tblGrid>
+        <w:gridCol w:w="3056"/>
+        <w:gridCol w:w="2878"/>
+      </w:tblGrid>
+      <w:tr>
+        <w:trPr>
+          <w:trHeight w:val="260"/>
+        </w:trPr>
+        <w:tc>
+          <w:tcPr>
+            <w:tcW w:w="3056" w:type="dxa"/>
+          </w:tcPr>
+          <w:p>
+            <w:pPr>
+              <w:pStyle w:val="Retraitcorpsdetexte"/>
+              <w:ind w:left="0"/>
+              <w:rPr>
+                <w:b/>
+                <w:bCs/>
+              </w:rPr>
+            </w:pPr>
+            <w:proofErr w:type="gramStart"/>
+            <w:r>
+              <w:rPr>
+                <w:b/>
+                <w:bCs/>
+              </w:rPr>
+              <w:t>classe</w:t>
+            </w:r>
+            <w:proofErr w:type="gramEnd"/>
+          </w:p>
+        </w:tc>
+        <w:tc>
+          <w:tcPr>
+            <w:tcW w:w="2878" w:type="dxa"/>
+          </w:tcPr>
+          <w:p>
+            <w:pPr>
+              <w:pStyle w:val="Retraitcorpsdetexte"/>
+              <w:ind w:left="0"/>
+              <w:rPr>
+                <w:b/>
+                <w:bCs/>
+              </w:rPr>
+            </w:pPr>
+            <w:proofErr w:type="spellStart"/>
+            <w:proofErr w:type="gramStart"/>
+            <w:r>
+              <w:rPr>
+                <w:b/>
+                <w:bCs/>
+              </w:rPr>
+              <w:t>attribu</w:t>
+            </w:r>
+            <w:proofErr w:type="spellEnd"/>
+            <w:proofErr w:type="gramEnd"/>
+          </w:p>
+        </w:tc>
+      </w:tr>
+      <w:tr>
+        <w:trPr>
+          <w:trHeight w:val="260"/>
+        </w:trPr>
+        <w:tc>
+          <w:tcPr>
+            <w:tcW w:w="3056" w:type="dxa"/>
+          </w:tcPr>
+          <w:p>
+            <w:pPr>
+              <w:pStyle w:val="Retraitcorpsdetexte"/>
+              <w:ind w:left="0"/>
+              <w:rPr>
+                <w:b/>
+                <w:bCs/>
+              </w:rPr>
+            </w:pPr>
+            <w:proofErr w:type="spellStart"/>
+            <w:r>
+              <w:t>NumeroPlace</w:t>
+            </w:r>
+            <w:proofErr w:type="spellEnd"/>
+          </w:p>
+        </w:tc>
+        <w:tc>
+          <w:tcPr>
+            <w:tcW w:w="2878" w:type="dxa"/>
+          </w:tcPr>
+          <w:p>
+            <w:pPr>
+              <w:pStyle w:val="Retraitcorpsdetexte"/>
+              <w:ind w:left="0"/>
+              <w:rPr>
+                <w:b/>
+                <w:bCs/>
+              </w:rPr>
+            </w:pPr>
+            <w:r>
+              <w:t>&lt;</w:t>
+            </w:r>
+            <w:proofErr w:type="spellStart"/>
+            <w:proofErr w:type="gramStart"/>
+            <w:r>
+              <w:t>int</w:t>
+            </w:r>
+            <w:proofErr w:type="spellEnd"/>
+            <w:proofErr w:type="gramEnd"/>
+            <w:r>
+              <w:t>&gt;</w:t>
+            </w:r>
+          </w:p>
+        </w:tc>
+      </w:tr>
+      <w:tr>
+        <w:trPr>
+          <w:trHeight w:val="260"/>
+        </w:trPr>
+        <w:tc>
+          <w:tcPr>
+            <w:tcW w:w="3056" w:type="dxa"/>
+          </w:tcPr>
+          <w:p>
+            <w:pPr>
+              <w:pStyle w:val="Retraitcorpsdetexte"/>
+              <w:ind w:left="0"/>
+            </w:pPr>
+            <w:proofErr w:type="spellStart"/>
+            <w:proofErr w:type="gramStart"/>
+            <w:r>
+              <w:t>heureEntre</w:t>
+            </w:r>
+            <w:proofErr w:type="spellEnd"/>
+            <w:proofErr w:type="gramEnd"/>
+          </w:p>
+        </w:tc>
+        <w:tc>
+          <w:tcPr>
+            <w:tcW w:w="2878" w:type="dxa"/>
+          </w:tcPr>
+          <w:p>
+            <w:pPr>
+              <w:pStyle w:val="Retraitcorpsdetexte"/>
+              <w:ind w:left="0"/>
+            </w:pPr>
+            <w:r>
+              <w:t>&lt;</w:t>
+            </w:r>
+            <w:proofErr w:type="gramStart"/>
+            <w:r>
+              <w:t>time</w:t>
+            </w:r>
+            <w:proofErr w:type="gramEnd"/>
+            <w:r>
+              <w:t>&gt;</w:t>
+            </w:r>
+          </w:p>
+        </w:tc>
+      </w:tr>
+      <w:tr>
+        <w:trPr>
+          <w:trHeight w:val="260"/>
+        </w:trPr>
+        <w:tc>
+          <w:tcPr>
+            <w:tcW w:w="3056" w:type="dxa"/>
+          </w:tcPr>
+          <w:p>
+            <w:pPr>
+              <w:pStyle w:val="Retraitcorpsdetexte"/>
+              <w:ind w:left="0"/>
+            </w:pPr>
+            <w:proofErr w:type="spellStart"/>
+            <w:proofErr w:type="gramStart"/>
+            <w:r>
+              <w:t>heureSortie</w:t>
+            </w:r>
+            <w:proofErr w:type="spellEnd"/>
+            <w:proofErr w:type="gramEnd"/>
+          </w:p>
+        </w:tc>
+        <w:tc>
+          <w:tcPr>
+            <w:tcW w:w="2878" w:type="dxa"/>
+          </w:tcPr>
+          <w:p>
+            <w:pPr>
+              <w:pStyle w:val="Retraitcorpsdetexte"/>
+              <w:ind w:left="0"/>
+            </w:pPr>
+            <w:r>
+              <w:t>&lt;</w:t>
+            </w:r>
+            <w:proofErr w:type="gramStart"/>
+            <w:r>
+              <w:t>time</w:t>
+            </w:r>
+            <w:proofErr w:type="gramEnd"/>
+            <w:r>
+              <w:t>&gt;</w:t>
+            </w:r>
+          </w:p>
+        </w:tc>
+      </w:tr>
+      <w:tr>
+        <w:trPr>
+          <w:trHeight w:val="260"/>
+        </w:trPr>
+        <w:tc>
+          <w:tcPr>
+            <w:tcW w:w="3056" w:type="dxa"/>
+          </w:tcPr>
+          <w:p>
+            <w:pPr>
+              <w:pStyle w:val="Retraitcorpsdetexte"/>
+              <w:ind w:left="0"/>
+            </w:pPr>
+            <w:proofErr w:type="spellStart"/>
+            <w:proofErr w:type="gramStart"/>
+            <w:r>
+              <w:t>tarifHorraire</w:t>
+            </w:r>
+            <w:proofErr w:type="spellEnd"/>
+            <w:proofErr w:type="gramEnd"/>
+          </w:p>
+        </w:tc>
+        <w:tc>
+          <w:tcPr>
+            <w:tcW w:w="2878" w:type="dxa"/>
+          </w:tcPr>
+          <w:p>
+            <w:pPr>
+              <w:pStyle w:val="Retraitcorpsdetexte"/>
+              <w:ind w:left="0"/>
+            </w:pPr>
+            <w:r>
+              <w:t>&lt;</w:t>
+            </w:r>
+            <w:proofErr w:type="spellStart"/>
+            <w:proofErr w:type="gramStart"/>
+            <w:r>
+              <w:t>int</w:t>
+            </w:r>
+            <w:proofErr w:type="spellEnd"/>
+            <w:proofErr w:type="gramEnd"/>
+            <w:r>
+              <w:t>&gt;</w:t>
+            </w:r>
+          </w:p>
+        </w:tc>
+      </w:tr>
+    </w:tbl>
+    <w:p>
+      <w:pPr>
+        <w:pStyle w:val="Retraitcorpsdetexte"/>
+        <w:numPr>
+          <w:ilvl w:val="0"/>
+          <w:numId w:val="48"/>
+        </w:numPr>
+      </w:pPr>
     </w:p>
     <w:p>
       <w:pPr>
@@ -5271,7 +5955,6 @@
       <w:bookmarkStart w:id="23" w:name="_Toc165969651"/>
       <w:bookmarkStart w:id="24" w:name="_Toc308526335"/>
       <w:r>
-        <w:lastRenderedPageBreak/>
         <w:t>Conception des tests</w:t>
       </w:r>
       <w:bookmarkEnd w:id="22"/>
@@ -5413,6 +6096,7 @@
         </w:numPr>
       </w:pPr>
       <w:r>
+        <w:lastRenderedPageBreak/>
         <w:t xml:space="preserve">Code source </w:t>
       </w:r>
       <w:r>
@@ -5863,7 +6547,6 @@
       <w:bookmarkStart w:id="50" w:name="_Toc165969657"/>
       <w:bookmarkStart w:id="51" w:name="_Toc308526346"/>
       <w:r>
-        <w:lastRenderedPageBreak/>
         <w:t>Divers</w:t>
       </w:r>
       <w:bookmarkEnd w:id="49"/>
@@ -6527,7 +7210,7 @@
               <w:noProof/>
               <w:szCs w:val="16"/>
             </w:rPr>
-            <w:t>28.08.2026 09:14</w:t>
+            <w:t>28.08.2026 11:20</w:t>
           </w:r>
           <w:r>
             <w:rPr>
@@ -6739,7 +7422,7 @@
         <v:path o:extrusionok="f" gradientshapeok="t" o:connecttype="rect"/>
         <o:lock v:ext="edit" aspectratio="t"/>
       </v:shapetype>
-      <v:shape id="_x0000_i1025" type="#_x0000_t75" style="width:12pt;height:12pt" o:bullet="t">
+      <v:shape id="_x0000_i1025" type="#_x0000_t75" style="width:11.9pt;height:11.9pt" o:bullet="t">
         <v:imagedata r:id="rId1" o:title="BD10263_"/>
       </v:shape>
     </w:pict>
@@ -11093,6 +11776,7 @@
   <w:style w:type="character" w:default="1" w:styleId="Policepardfaut">
     <w:name w:val="Default Paragraph Font"/>
     <w:uiPriority w:val="1"/>
+    <w:semiHidden/>
     <w:unhideWhenUsed/>
   </w:style>
   <w:style w:type="table" w:default="1" w:styleId="TableauNormal">
@@ -11903,6 +12587,15 @@
 </file>
 
 <file path=customXml/item1.xml><?xml version="1.0" encoding="utf-8"?>
+<?mso-contentType ?>
+<FormTemplates xmlns="http://schemas.microsoft.com/sharepoint/v3/contenttype/forms">
+  <Display>DocumentLibraryForm</Display>
+  <Edit>DocumentLibraryForm</Edit>
+  <New>DocumentLibraryForm</New>
+</FormTemplates>
+</file>
+
+<file path=customXml/item2.xml><?xml version="1.0" encoding="utf-8"?>
 <ct:contentTypeSchema xmlns:ct="http://schemas.microsoft.com/office/2006/metadata/contentType" xmlns:ma="http://schemas.microsoft.com/office/2006/metadata/properties/metaAttributes" ct:_="" ma:_="" ma:contentTypeName="Document" ma:contentTypeID="0x010100FBB99F57F4D89D439F52EDCD0CED316B" ma:contentTypeVersion="7" ma:contentTypeDescription="Crée un document." ma:contentTypeScope="" ma:versionID="7f146099027e1b74c82fbe61e090590b">
   <xsd:schema xmlns:xsd="http://www.w3.org/2001/XMLSchema" xmlns:xs="http://www.w3.org/2001/XMLSchema" xmlns:p="http://schemas.microsoft.com/office/2006/metadata/properties" xmlns:ns2="6b19550a-bdc3-4796-8096-c6911560d534" targetNamespace="http://schemas.microsoft.com/office/2006/metadata/properties" ma:root="true" ma:fieldsID="7044bf5f632aa66a3f32a70d04b92caa" ns2:_="">
     <xsd:import namespace="6b19550a-bdc3-4796-8096-c6911560d534"/>
@@ -12064,26 +12757,25 @@
 </ct:contentTypeSchema>
 </file>
 
-<file path=customXml/item2.xml><?xml version="1.0" encoding="utf-8"?>
-<?mso-contentType ?>
-<FormTemplates xmlns="http://schemas.microsoft.com/sharepoint/v3/contenttype/forms">
-  <Display>DocumentLibraryForm</Display>
-  <Edit>DocumentLibraryForm</Edit>
-  <New>DocumentLibraryForm</New>
-</FormTemplates>
-</file>
-
 <file path=customXml/item3.xml><?xml version="1.0" encoding="utf-8"?>
-<b:Sources xmlns:b="http://schemas.openxmlformats.org/officeDocument/2006/bibliography" xmlns="http://schemas.openxmlformats.org/officeDocument/2006/bibliography" SelectedStyle="\APA.XSL" StyleName="APA"/>
-</file>
-
-<file path=customXml/item4.xml><?xml version="1.0" encoding="utf-8"?>
 <p:properties xmlns:p="http://schemas.microsoft.com/office/2006/metadata/properties" xmlns:xsi="http://www.w3.org/2001/XMLSchema-instance" xmlns:pc="http://schemas.microsoft.com/office/infopath/2007/PartnerControls">
   <documentManagement/>
 </p:properties>
 </file>
 
+<file path=customXml/item4.xml><?xml version="1.0" encoding="utf-8"?>
+<b:Sources xmlns:b="http://schemas.openxmlformats.org/officeDocument/2006/bibliography" xmlns="http://schemas.openxmlformats.org/officeDocument/2006/bibliography" SelectedStyle="\APA.XSL" StyleName="APA"/>
+</file>
+
 <file path=customXml/itemProps1.xml><?xml version="1.0" encoding="utf-8"?>
+<ds:datastoreItem xmlns:ds="http://schemas.openxmlformats.org/officeDocument/2006/customXml" ds:itemID="{6C3F7A66-EDE3-46FD-83EB-3C265E5D2669}">
+  <ds:schemaRefs>
+    <ds:schemaRef ds:uri="http://schemas.microsoft.com/sharepoint/v3/contenttype/forms"/>
+  </ds:schemaRefs>
+</ds:datastoreItem>
+</file>
+
+<file path=customXml/itemProps2.xml><?xml version="1.0" encoding="utf-8"?>
 <ds:datastoreItem xmlns:ds="http://schemas.openxmlformats.org/officeDocument/2006/customXml" ds:itemID="{75ED066B-A5C4-4F00-9682-79C6BF6A6E3B}">
   <ds:schemaRefs>
     <ds:schemaRef ds:uri="http://schemas.microsoft.com/office/2006/metadata/contentType"/>
@@ -12101,27 +12793,19 @@
 </ds:datastoreItem>
 </file>
 
-<file path=customXml/itemProps2.xml><?xml version="1.0" encoding="utf-8"?>
-<ds:datastoreItem xmlns:ds="http://schemas.openxmlformats.org/officeDocument/2006/customXml" ds:itemID="{6C3F7A66-EDE3-46FD-83EB-3C265E5D2669}">
-  <ds:schemaRefs>
-    <ds:schemaRef ds:uri="http://schemas.microsoft.com/sharepoint/v3/contenttype/forms"/>
-  </ds:schemaRefs>
-</ds:datastoreItem>
-</file>
-
 <file path=customXml/itemProps3.xml><?xml version="1.0" encoding="utf-8"?>
-<ds:datastoreItem xmlns:ds="http://schemas.openxmlformats.org/officeDocument/2006/customXml" ds:itemID="{C8C35155-3E6A-4058-B6E4-303717845E3B}">
-  <ds:schemaRefs>
-    <ds:schemaRef ds:uri="http://schemas.openxmlformats.org/officeDocument/2006/bibliography"/>
-  </ds:schemaRefs>
-</ds:datastoreItem>
-</file>
-
-<file path=customXml/itemProps4.xml><?xml version="1.0" encoding="utf-8"?>
 <ds:datastoreItem xmlns:ds="http://schemas.openxmlformats.org/officeDocument/2006/customXml" ds:itemID="{2319CDB8-A2CD-412D-8359-13E6B4DF1FF4}">
   <ds:schemaRefs>
     <ds:schemaRef ds:uri="http://schemas.microsoft.com/office/2006/metadata/properties"/>
     <ds:schemaRef ds:uri="http://schemas.microsoft.com/office/infopath/2007/PartnerControls"/>
   </ds:schemaRefs>
 </ds:datastoreItem>
+</file>
+
+<file path=customXml/itemProps4.xml><?xml version="1.0" encoding="utf-8"?>
+<ds:datastoreItem xmlns:ds="http://schemas.openxmlformats.org/officeDocument/2006/customXml" ds:itemID="{C8C35155-3E6A-4058-B6E4-303717845E3B}">
+  <ds:schemaRefs>
+    <ds:schemaRef ds:uri="http://schemas.openxmlformats.org/officeDocument/2006/bibliography"/>
+  </ds:schemaRefs>
+</ds:datastoreItem>
 </file>
</xml_diff>